<commit_message>
Final audit: cafeteria six-step process; remove draft language from guides, decks, and lesson docs (1 of 2)
</commit_message>
<xml_diff>
--- a/resources/systems/bathroom.docx
+++ b/resources/systems/bathroom.docx
@@ -688,7 +688,7 @@
           <w:color w:val="E21C24"/>
           <w:sz w:val="26"/>
         </w:rPr>
-        <w:t>TEACHER LANGUAGE TO PRESERVE</w:t>
+        <w:t>TEACHER LANGUAGE</w:t>
       </w:r>
     </w:p>
     <w:p>
@@ -749,21 +749,6 @@
           <w:sz w:val="22"/>
         </w:rPr>
         <w:t>"Reset. Walk it again."</w:t>
-      </w:r>
-    </w:p>
-    <w:p>
-      <w:pPr>
-        <w:pStyle w:val="ListBullet"/>
-      </w:pPr>
-      <w:r>
-        <w:rPr>
-          <w:rFonts w:ascii="Calibri" w:hAnsi="Calibri"/>
-          <w:b w:val="0"/>
-          <w:i w:val="0"/>
-          <w:color w:val="4A4A4A"/>
-          <w:sz w:val="22"/>
-        </w:rPr>
-        <w:t>Preserve any exact quoted lines from the source section above.</w:t>
       </w:r>
     </w:p>
     <w:p>

</xml_diff>